<commit_message>
fix: restringe atendimento a notebooks e PCs e atualiza entregas de POO
</commit_message>
<xml_diff>
--- a/docs/Ficha_Padrao_Entrega_Atividade_08_Final.docx
+++ b/docs/Ficha_Padrao_Entrega_Atividade_08_Final.docx
@@ -162,7 +162,7 @@
         <w:br/>
       </w:r>
       <w:r>
-        <w:t>Equipamento foi definido como superclasse abstrata. Notebook e Celular são as duas subclasses e chamam super(...) para reutilizar as validações de tipo, marca e defeito. Ambas também herdam os getters e exibirDados().</w:t>
+        <w:t>Equipamento foi definido como superclasse abstrata. Notebook e Desktop são as duas subclasses e chamam super(...) para reutilizar as validações de tipo, marca e defeito. Ambas também herdam os getters e exibirDados().</w:t>
       </w:r>
       <w:r>
         <w:br/>
@@ -180,7 +180,7 @@
         <w:br/>
       </w:r>
       <w:r>
-        <w:t>Notebook e Celular sobrescrevem descreverAtendimento() com @Override. As implementações chamam super.descreverAtendimento() e acrescentam comportamento específico: quantidade de memória RAM para notebook e configuração de chips para celular.</w:t>
+        <w:t>Notebook e Desktop sobrescrevem descreverAtendimento() com @Override. As implementações chamam super.descreverAtendimento() e acrescentam comportamento específico: quantidade de memória RAM para notebook e configuração de vídeo para desktop.</w:t>
       </w:r>
       <w:r>
         <w:br/>
@@ -198,11 +198,11 @@
         <w:br/>
       </w:r>
       <w:r>
-        <w:t>O Main percorre uma List&lt;Equipamento&gt; contendo um Notebook e um Celular. Saída observada:</w:t>
+        <w:t>O Main percorre uma List&lt;Equipamento&gt; contendo um Notebook e um Desktop. Saída observada:</w:t>
         <w:br/>
         <w:t>Tipo: NOTEBOOK | Marca: Dell | Defeito: Não liga | Especialização: notebook com 16 GB de RAM</w:t>
         <w:br/>
-        <w:t>Tipo: CELULAR | Marca: Samsung | Defeito: Tela quebrada | Especialização: celular com dual chip</w:t>
+        <w:t>Tipo: DESKTOP | Marca: Dell | Defeito: Sem imagem | Especialização: desktop com placa de vídeo dedicada</w:t>
       </w:r>
       <w:r>
         <w:br/>
@@ -220,7 +220,7 @@
         <w:br/>
       </w:r>
       <w:r>
-        <w:t>EquipamentoTest cobre a especialização de Notebook, a especialização de Celular, a herança dos dados comuns e a herança da validação de marca nas duas subclasses. Resultado de mvn clean test: 8 testes executados, 0 falhas e 0 erros.</w:t>
+        <w:t>EquipamentoTest cobre a especialização de Notebook, a especialização de Desktop, a herança dos dados comuns e a herança da validação de marca nas duas subclasses. Resultado de mvn clean test: 8 testes executados, 0 falhas e 0 erros.</w:t>
       </w:r>
       <w:r>
         <w:br/>
@@ -238,7 +238,7 @@
         <w:br/>
       </w:r>
       <w:r>
-        <w:t>A herança é adequada porque notebook e celular são tipos de equipamento recebidos pela assistência técnica. Ambos compartilham identidade, marca, defeito, validações e forma básica de exibição, evitando duplicação na superclasse. Cada subtipo acrescenta seus próprios dados e especializa a descrição do atendimento sem perder o contrato comum de Equipamento.</w:t>
+        <w:t>A herança é adequada porque notebook e desktop são tipos de equipamento recebidos pela assistência técnica. Ambos compartilham identidade, marca, defeito, validações e forma básica de exibição, evitando duplicação na superclasse. Cada subtipo acrescenta seus próprios dados e especializa a descrição do atendimento sem perder o contrato comum de Equipamento.</w:t>
       </w:r>
       <w:r>
         <w:br/>
@@ -326,7 +326,7 @@
         </w:rPr>
       </w:pPr>
       <w:r>
-        <w:t>Decisões tomadas: usar Equipamento como superclasse abstrata e Notebook/Celular como especializações; manter as validações comuns na superclasse; demonstrar o polimorfismo por uma coleção do tipo Equipamento.</w:t>
+        <w:t>Decisões tomadas: usar Equipamento como superclasse abstrata e Notebook/Desktop como especializações; manter as validações comuns na superclasse; demonstrar o polimorfismo por uma coleção do tipo Equipamento.</w:t>
       </w:r>
     </w:p>
     <w:p>

</xml_diff>